<commit_message>
court(utahctapp): amicus brief gated on all three engines, opening brief latex gated (fb-595.54.72)
Co-Authored-By: Claude Opus 5.5 <noreply@anthropic.com>
</commit_message>
<xml_diff>
--- a/courts/tenth-circuit/utah/state/court-of-appeals/amicus-brief/usage/OUTPUT-amicus-brief.docx
+++ b/courts/tenth-circuit/utah/state/court-of-appeals/amicus-brief/usage/OUTPUT-amicus-brief.docx
@@ -1625,7 +1625,7 @@
         <w:tab/>
       </w:r>
       <w:r>
-        <w:t xml:space="preserve">4</w:t>
+        <w:t xml:space="preserve">1</w:t>
       </w:r>
     </w:p>
     <w:p>
@@ -1653,7 +1653,7 @@
         <w:tab/>
       </w:r>
       <w:r>
-        <w:t xml:space="preserve">4</w:t>
+        <w:t xml:space="preserve">1</w:t>
       </w:r>
     </w:p>
     <w:p>
@@ -1693,7 +1693,7 @@
         <w:tab/>
       </w:r>
       <w:r>
-        <w:t xml:space="preserve">4</w:t>
+        <w:t xml:space="preserve">1</w:t>
       </w:r>
     </w:p>
     <w:p>
@@ -1715,7 +1715,7 @@
         <w:tab/>
       </w:r>
       <w:r>
-        <w:t xml:space="preserve">6</w:t>
+        <w:t xml:space="preserve">3</w:t>
       </w:r>
     </w:p>
     <w:p>
@@ -1791,7 +1791,7 @@
         <w:tab/>
       </w:r>
       <w:r>
-        <w:t xml:space="preserve">15</w:t>
+        <w:t xml:space="preserve">12</w:t>
       </w:r>
     </w:p>
     <w:p>
@@ -1855,7 +1855,7 @@
         <w:tab/>
       </w:r>
       <w:r>
-        <w:t xml:space="preserve">16</w:t>
+        <w:t xml:space="preserve">13</w:t>
       </w:r>
     </w:p>
     <w:p>
@@ -1919,7 +1919,7 @@
         <w:tab/>
       </w:r>
       <w:r>
-        <w:t xml:space="preserve">18</w:t>
+        <w:t xml:space="preserve">15</w:t>
       </w:r>
     </w:p>
     <w:p>
@@ -1983,7 +1983,7 @@
         <w:tab/>
       </w:r>
       <w:r>
-        <w:t xml:space="preserve">19</w:t>
+        <w:t xml:space="preserve">16</w:t>
       </w:r>
     </w:p>
     <w:p>
@@ -2059,7 +2059,7 @@
         <w:tab/>
       </w:r>
       <w:r>
-        <w:t xml:space="preserve">22</w:t>
+        <w:t xml:space="preserve">19</w:t>
       </w:r>
     </w:p>
     <w:p>
@@ -2081,7 +2081,7 @@
         <w:tab/>
       </w:r>
       <w:r>
-        <w:t xml:space="preserve">28</w:t>
+        <w:t xml:space="preserve">25</w:t>
       </w:r>
     </w:p>
     <w:p>
@@ -2262,7 +2262,7 @@
         <w:tab/>
       </w:r>
       <w:r>
-        <w:t xml:space="preserve">7</w:t>
+        <w:t xml:space="preserve">4</w:t>
       </w:r>
     </w:p>
     <w:p>
@@ -2419,7 +2419,7 @@
         <w:tab/>
       </w:r>
       <w:r>
-        <w:t xml:space="preserve">8</w:t>
+        <w:t xml:space="preserve">5</w:t>
       </w:r>
     </w:p>
     <w:p>
@@ -2506,7 +2506,7 @@
         <w:tab/>
       </w:r>
       <w:r>
-        <w:t xml:space="preserve">23</w:t>
+        <w:t xml:space="preserve">20</w:t>
       </w:r>
     </w:p>
     <w:p>
@@ -2587,7 +2587,7 @@
         <w:tab/>
       </w:r>
       <w:r>
-        <w:t xml:space="preserve">27</w:t>
+        <w:t xml:space="preserve">24</w:t>
       </w:r>
     </w:p>
     <w:p>
@@ -2668,7 +2668,7 @@
         <w:tab/>
       </w:r>
       <w:r>
-        <w:t xml:space="preserve">11</w:t>
+        <w:t xml:space="preserve">8</w:t>
       </w:r>
     </w:p>
     <w:p>
@@ -2767,7 +2767,7 @@
         <w:tab/>
       </w:r>
       <w:r>
-        <w:t xml:space="preserve">16</w:t>
+        <w:t xml:space="preserve">13</w:t>
       </w:r>
     </w:p>
     <w:p>
@@ -2848,7 +2848,7 @@
         <w:tab/>
       </w:r>
       <w:r>
-        <w:t xml:space="preserve">15, 23</w:t>
+        <w:t xml:space="preserve">12, 20</w:t>
       </w:r>
     </w:p>
     <w:p>
@@ -2947,7 +2947,7 @@
         <w:tab/>
       </w:r>
       <w:r>
-        <w:t xml:space="preserve">28</w:t>
+        <w:t xml:space="preserve">25</w:t>
       </w:r>
     </w:p>
     <w:p>
@@ -3046,7 +3046,7 @@
         <w:tab/>
       </w:r>
       <w:r>
-        <w:t xml:space="preserve">11</w:t>
+        <w:t xml:space="preserve">8</w:t>
       </w:r>
     </w:p>
     <w:p>
@@ -3139,7 +3139,7 @@
         <w:tab/>
       </w:r>
       <w:r>
-        <w:t xml:space="preserve">16</w:t>
+        <w:t xml:space="preserve">13</w:t>
       </w:r>
     </w:p>
     <w:p>
@@ -3232,7 +3232,7 @@
         <w:tab/>
       </w:r>
       <w:r>
-        <w:t xml:space="preserve">27</w:t>
+        <w:t xml:space="preserve">24</w:t>
       </w:r>
     </w:p>
     <w:p>
@@ -3325,7 +3325,7 @@
         <w:tab/>
       </w:r>
       <w:r>
-        <w:t xml:space="preserve">18</w:t>
+        <w:t xml:space="preserve">15</w:t>
       </w:r>
     </w:p>
     <w:p>
@@ -3418,7 +3418,7 @@
         <w:tab/>
       </w:r>
       <w:r>
-        <w:t xml:space="preserve">8</w:t>
+        <w:t xml:space="preserve">5</w:t>
       </w:r>
     </w:p>
     <w:p>
@@ -3511,7 +3511,7 @@
         <w:tab/>
       </w:r>
       <w:r>
-        <w:t xml:space="preserve">19</w:t>
+        <w:t xml:space="preserve">16</w:t>
       </w:r>
     </w:p>
     <w:p>
@@ -3604,7 +3604,7 @@
         <w:tab/>
       </w:r>
       <w:r>
-        <w:t xml:space="preserve">27</w:t>
+        <w:t xml:space="preserve">24</w:t>
       </w:r>
     </w:p>
     <w:p>
@@ -3691,7 +3691,7 @@
         <w:tab/>
       </w:r>
       <w:r>
-        <w:t xml:space="preserve">11</w:t>
+        <w:t xml:space="preserve">8</w:t>
       </w:r>
     </w:p>
     <w:p>
@@ -3784,7 +3784,7 @@
         <w:tab/>
       </w:r>
       <w:r>
-        <w:t xml:space="preserve">26</w:t>
+        <w:t xml:space="preserve">24</w:t>
       </w:r>
     </w:p>
     <w:p>
@@ -3877,7 +3877,7 @@
         <w:tab/>
       </w:r>
       <w:r>
-        <w:t xml:space="preserve">16</w:t>
+        <w:t xml:space="preserve">13</w:t>
       </w:r>
     </w:p>
     <w:p>
@@ -3976,7 +3976,7 @@
         <w:tab/>
       </w:r>
       <w:r>
-        <w:t xml:space="preserve">16</w:t>
+        <w:t xml:space="preserve">13</w:t>
       </w:r>
     </w:p>
     <w:p>
@@ -4069,7 +4069,7 @@
         <w:tab/>
       </w:r>
       <w:r>
-        <w:t xml:space="preserve">11</w:t>
+        <w:t xml:space="preserve">8</w:t>
       </w:r>
     </w:p>
     <w:p>
@@ -4156,7 +4156,7 @@
         <w:tab/>
       </w:r>
       <w:r>
-        <w:t xml:space="preserve">10</w:t>
+        <w:t xml:space="preserve">7</w:t>
       </w:r>
     </w:p>
     <w:p>
@@ -4255,7 +4255,7 @@
         <w:tab/>
       </w:r>
       <w:r>
-        <w:t xml:space="preserve">17</w:t>
+        <w:t xml:space="preserve">14</w:t>
       </w:r>
     </w:p>
     <w:p>
@@ -4348,88 +4348,7 @@
         <w:tab/>
       </w:r>
       <w:r>
-        <w:t xml:space="preserve">12</w:t>
-      </w:r>
-    </w:p>
-    <w:p>
-      <w:pPr>
-        <w:keepLines/>
-        <w:tabs>
-          <w:tab w:val="right" w:leader="dot" w:pos="9360"/>
-        </w:tabs>
-        <w:spacing w:before="196" w:after="0" w:line="322" w:lineRule="exact"/>
-        <w:ind w:left="360" w:right="1540" w:hanging="360"/>
-      </w:pPr>
-      <w:r>
-        <w:rPr>
-          <w:i/>
-          <w:iCs/>
-        </w:rPr>
-        <w:t xml:space="preserve">Strickland</w:t>
-      </w:r>
-      <w:r>
-        <w:rPr>
-          <w:i/>
-          <w:iCs/>
-        </w:rPr>
-        <w:t xml:space="preserve"> </w:t>
-      </w:r>
-      <w:r>
-        <w:rPr>
-          <w:i/>
-          <w:iCs/>
-        </w:rPr>
-        <w:t xml:space="preserve">v.</w:t>
-      </w:r>
-      <w:r>
-        <w:rPr>
-          <w:i/>
-          <w:iCs/>
-        </w:rPr>
-        <w:t xml:space="preserve"> </w:t>
-      </w:r>
-      <w:r>
-        <w:rPr>
-          <w:i/>
-          <w:iCs/>
-        </w:rPr>
-        <w:t xml:space="preserve">Washington</w:t>
-      </w:r>
-      <w:r>
-        <w:t xml:space="preserve">,</w:t>
-      </w:r>
-      <w:r>
-        <w:t xml:space="preserve"> </w:t>
-      </w:r>
-      <w:r>
-        <w:t xml:space="preserve">466</w:t>
-      </w:r>
-      <w:r>
-        <w:t xml:space="preserve"> </w:t>
-      </w:r>
-      <w:r>
-        <w:t xml:space="preserve">U.S.</w:t>
-      </w:r>
-      <w:r>
-        <w:t xml:space="preserve"> </w:t>
-      </w:r>
-      <w:r>
-        <w:t xml:space="preserve">668</w:t>
-      </w:r>
-      <w:r>
-        <w:t xml:space="preserve"> </w:t>
-      </w:r>
-      <w:r>
-        <w:t xml:space="preserve">(1984)</w:t>
-      </w:r>
-      <w:r>
-        <w:t xml:space="preserve">   </w:t>
-      </w:r>
-      <w:r>
-        <w:tab/>
-      </w:r>
-      <w:r>
-        <w:t xml:space="preserve">10, 11, 12, 13</w:t>
+        <w:t xml:space="preserve">9</w:t>
       </w:r>
     </w:p>
     <w:p>
@@ -4446,7 +4365,7 @@
           <w:i/>
           <w:iCs/>
         </w:rPr>
-        <w:t xml:space="preserve">Whalen</w:t>
+        <w:t xml:space="preserve">Strickland</w:t>
       </w:r>
       <w:r>
         <w:rPr>
@@ -4474,7 +4393,7 @@
           <w:i/>
           <w:iCs/>
         </w:rPr>
-        <w:t xml:space="preserve">Roe</w:t>
+        <w:t xml:space="preserve">Washington</w:t>
       </w:r>
       <w:r>
         <w:t xml:space="preserve">,</w:t>
@@ -4483,7 +4402,7 @@
         <w:t xml:space="preserve"> </w:t>
       </w:r>
       <w:r>
-        <w:t xml:space="preserve">429</w:t>
+        <w:t xml:space="preserve">466</w:t>
       </w:r>
       <w:r>
         <w:t xml:space="preserve"> </w:t>
@@ -4495,13 +4414,13 @@
         <w:t xml:space="preserve"> </w:t>
       </w:r>
       <w:r>
-        <w:t xml:space="preserve">589</w:t>
-      </w:r>
-      <w:r>
-        <w:t xml:space="preserve"> </w:t>
-      </w:r>
-      <w:r>
-        <w:t xml:space="preserve">(1977)</w:t>
+        <w:t xml:space="preserve">668</w:t>
+      </w:r>
+      <w:r>
+        <w:t xml:space="preserve"> </w:t>
+      </w:r>
+      <w:r>
+        <w:t xml:space="preserve">(1984)</w:t>
       </w:r>
       <w:r>
         <w:t xml:space="preserve">   </w:t>
@@ -4510,23 +4429,7 @@
         <w:tab/>
       </w:r>
       <w:r>
-        <w:t xml:space="preserve">26</w:t>
-      </w:r>
-    </w:p>
-    <w:p>
-      <w:pPr>
-        <w:keepNext/>
-        <w:keepLines/>
-        <w:spacing w:before="308" w:after="56" w:line="322" w:lineRule="exact"/>
-        <w:ind w:left="0" w:firstLine="0"/>
-        <w:jc w:val="left"/>
-      </w:pPr>
-      <w:r>
-        <w:rPr>
-          <w:b/>
-          <w:bCs/>
-        </w:rPr>
-        <w:t xml:space="preserve">Statutes</w:t>
+        <w:t xml:space="preserve">7, 8, 9, 10</w:t>
       </w:r>
     </w:p>
     <w:p>
@@ -4539,29 +4442,66 @@
         <w:ind w:left="360" w:right="1120" w:hanging="360"/>
       </w:pPr>
       <w:r>
-        <w:t xml:space="preserve">Utah</w:t>
-      </w:r>
-      <w:r>
-        <w:t xml:space="preserve"> </w:t>
-      </w:r>
-      <w:r>
-        <w:t xml:space="preserve">Code</w:t>
-      </w:r>
-      <w:r>
-        <w:t xml:space="preserve"> </w:t>
-      </w:r>
-      <w:r>
-        <w:t xml:space="preserve">§</w:t>
-      </w:r>
-      <w:r>
-        <w:t xml:space="preserve"> </w:t>
-      </w:r>
-      <w:r>
-        <w:t xml:space="preserve">77</w:t>
-        <w:noBreakHyphen/>
-        <w:t xml:space="preserve">37</w:t>
-        <w:noBreakHyphen/>
-        <w:t xml:space="preserve">1</w:t>
+        <w:rPr>
+          <w:i/>
+          <w:iCs/>
+        </w:rPr>
+        <w:t xml:space="preserve">Whalen</w:t>
+      </w:r>
+      <w:r>
+        <w:rPr>
+          <w:i/>
+          <w:iCs/>
+        </w:rPr>
+        <w:t xml:space="preserve"> </w:t>
+      </w:r>
+      <w:r>
+        <w:rPr>
+          <w:i/>
+          <w:iCs/>
+        </w:rPr>
+        <w:t xml:space="preserve">v.</w:t>
+      </w:r>
+      <w:r>
+        <w:rPr>
+          <w:i/>
+          <w:iCs/>
+        </w:rPr>
+        <w:t xml:space="preserve"> </w:t>
+      </w:r>
+      <w:r>
+        <w:rPr>
+          <w:i/>
+          <w:iCs/>
+        </w:rPr>
+        <w:t xml:space="preserve">Roe</w:t>
+      </w:r>
+      <w:r>
+        <w:t xml:space="preserve">,</w:t>
+      </w:r>
+      <w:r>
+        <w:t xml:space="preserve"> </w:t>
+      </w:r>
+      <w:r>
+        <w:t xml:space="preserve">429</w:t>
+      </w:r>
+      <w:r>
+        <w:t xml:space="preserve"> </w:t>
+      </w:r>
+      <w:r>
+        <w:t xml:space="preserve">U.S.</w:t>
+      </w:r>
+      <w:r>
+        <w:t xml:space="preserve"> </w:t>
+      </w:r>
+      <w:r>
+        <w:t xml:space="preserve">589</w:t>
+      </w:r>
+      <w:r>
+        <w:t xml:space="preserve"> </w:t>
+      </w:r>
+      <w:r>
+        <w:t xml:space="preserve">(1977)</w:t>
       </w:r>
       <w:r>
         <w:t xml:space="preserve">   </w:t>
@@ -4570,7 +4510,23 @@
         <w:tab/>
       </w:r>
       <w:r>
-        <w:t xml:space="preserve">26, 27</w:t>
+        <w:t xml:space="preserve">23</w:t>
+      </w:r>
+    </w:p>
+    <w:p>
+      <w:pPr>
+        <w:keepNext/>
+        <w:keepLines/>
+        <w:spacing w:before="308" w:after="56" w:line="322" w:lineRule="exact"/>
+        <w:ind w:left="0" w:firstLine="0"/>
+        <w:jc w:val="left"/>
+      </w:pPr>
+      <w:r>
+        <w:rPr>
+          <w:b/>
+          <w:bCs/>
+        </w:rPr>
+        <w:t xml:space="preserve">Statutes</w:t>
       </w:r>
     </w:p>
     <w:p>
@@ -4605,7 +4561,7 @@
         <w:noBreakHyphen/>
         <w:t xml:space="preserve">37</w:t>
         <w:noBreakHyphen/>
-        <w:t xml:space="preserve">4</w:t>
+        <w:t xml:space="preserve">1</w:t>
       </w:r>
       <w:r>
         <w:t xml:space="preserve">   </w:t>
@@ -4614,7 +4570,7 @@
         <w:tab/>
       </w:r>
       <w:r>
-        <w:t xml:space="preserve">27</w:t>
+        <w:t xml:space="preserve">23, 24</w:t>
       </w:r>
     </w:p>
     <w:p>
@@ -4647,9 +4603,9 @@
       <w:r>
         <w:t xml:space="preserve">77</w:t>
         <w:noBreakHyphen/>
-        <w:t xml:space="preserve">39</w:t>
+        <w:t xml:space="preserve">37</w:t>
         <w:noBreakHyphen/>
-        <w:t xml:space="preserve">2</w:t>
+        <w:t xml:space="preserve">4</w:t>
       </w:r>
       <w:r>
         <w:t xml:space="preserve">   </w:t>
@@ -4658,37 +4614,7 @@
         <w:tab/>
       </w:r>
       <w:r>
-        <w:t xml:space="preserve">27</w:t>
-      </w:r>
-    </w:p>
-    <w:p>
-      <w:pPr>
-        <w:keepNext/>
-        <w:keepLines/>
-        <w:spacing w:before="308" w:after="56" w:line="322" w:lineRule="exact"/>
-        <w:ind w:left="0" w:firstLine="0"/>
-        <w:jc w:val="left"/>
-      </w:pPr>
-      <w:r>
-        <w:rPr>
-          <w:b/>
-          <w:bCs/>
-        </w:rPr>
-        <w:t xml:space="preserve">Constitutional</w:t>
-      </w:r>
-      <w:r>
-        <w:rPr>
-          <w:b/>
-          <w:bCs/>
-        </w:rPr>
-        <w:t xml:space="preserve"> </w:t>
-      </w:r>
-      <w:r>
-        <w:rPr>
-          <w:b/>
-          <w:bCs/>
-        </w:rPr>
-        <w:t xml:space="preserve">Provisions</w:t>
+        <w:t xml:space="preserve">24</w:t>
       </w:r>
     </w:p>
     <w:p>
@@ -4707,19 +4633,7 @@
         <w:t xml:space="preserve"> </w:t>
       </w:r>
       <w:r>
-        <w:t xml:space="preserve">Const.</w:t>
-      </w:r>
-      <w:r>
-        <w:t xml:space="preserve"> </w:t>
-      </w:r>
-      <w:r>
-        <w:t xml:space="preserve">art.</w:t>
-      </w:r>
-      <w:r>
-        <w:t xml:space="preserve"> </w:t>
-      </w:r>
-      <w:r>
-        <w:t xml:space="preserve">I,</w:t>
+        <w:t xml:space="preserve">Code</w:t>
       </w:r>
       <w:r>
         <w:t xml:space="preserve"> </w:t>
@@ -4731,7 +4645,11 @@
         <w:t xml:space="preserve"> </w:t>
       </w:r>
       <w:r>
-        <w:t xml:space="preserve">28</w:t>
+        <w:t xml:space="preserve">77</w:t>
+        <w:noBreakHyphen/>
+        <w:t xml:space="preserve">39</w:t>
+        <w:noBreakHyphen/>
+        <w:t xml:space="preserve">2</w:t>
       </w:r>
       <w:r>
         <w:t xml:space="preserve">   </w:t>
@@ -4740,7 +4658,7 @@
         <w:tab/>
       </w:r>
       <w:r>
-        <w:t xml:space="preserve">4, 26, 27</w:t>
+        <w:t xml:space="preserve">24</w:t>
       </w:r>
     </w:p>
     <w:p>
@@ -4756,7 +4674,21 @@
           <w:b/>
           <w:bCs/>
         </w:rPr>
-        <w:t xml:space="preserve">Rules</w:t>
+        <w:t xml:space="preserve">Constitutional</w:t>
+      </w:r>
+      <w:r>
+        <w:rPr>
+          <w:b/>
+          <w:bCs/>
+        </w:rPr>
+        <w:t xml:space="preserve"> </w:t>
+      </w:r>
+      <w:r>
+        <w:rPr>
+          <w:b/>
+          <w:bCs/>
+        </w:rPr>
+        <w:t xml:space="preserve">Provisions</w:t>
       </w:r>
     </w:p>
     <w:p>
@@ -4775,25 +4707,31 @@
         <w:t xml:space="preserve"> </w:t>
       </w:r>
       <w:r>
-        <w:t xml:space="preserve">R.</w:t>
-      </w:r>
-      <w:r>
-        <w:t xml:space="preserve"> </w:t>
-      </w:r>
-      <w:r>
-        <w:t xml:space="preserve">App.</w:t>
-      </w:r>
-      <w:r>
-        <w:t xml:space="preserve"> </w:t>
-      </w:r>
-      <w:r>
-        <w:t xml:space="preserve">P.</w:t>
-      </w:r>
-      <w:r>
-        <w:t xml:space="preserve"> </w:t>
-      </w:r>
-      <w:r>
-        <w:t xml:space="preserve">30</w:t>
+        <w:t xml:space="preserve">Const.</w:t>
+      </w:r>
+      <w:r>
+        <w:t xml:space="preserve"> </w:t>
+      </w:r>
+      <w:r>
+        <w:t xml:space="preserve">art.</w:t>
+      </w:r>
+      <w:r>
+        <w:t xml:space="preserve"> </w:t>
+      </w:r>
+      <w:r>
+        <w:t xml:space="preserve">I,</w:t>
+      </w:r>
+      <w:r>
+        <w:t xml:space="preserve"> </w:t>
+      </w:r>
+      <w:r>
+        <w:t xml:space="preserve">§</w:t>
+      </w:r>
+      <w:r>
+        <w:t xml:space="preserve"> </w:t>
+      </w:r>
+      <w:r>
+        <w:t xml:space="preserve">28</w:t>
       </w:r>
       <w:r>
         <w:t xml:space="preserve">   </w:t>
@@ -4802,7 +4740,23 @@
         <w:tab/>
       </w:r>
       <w:r>
-        <w:t xml:space="preserve">24</w:t>
+        <w:t xml:space="preserve">1, 23, 24</w:t>
+      </w:r>
+    </w:p>
+    <w:p>
+      <w:pPr>
+        <w:keepNext/>
+        <w:keepLines/>
+        <w:spacing w:before="308" w:after="56" w:line="322" w:lineRule="exact"/>
+        <w:ind w:left="0" w:firstLine="0"/>
+        <w:jc w:val="left"/>
+      </w:pPr>
+      <w:r>
+        <w:rPr>
+          <w:b/>
+          <w:bCs/>
+        </w:rPr>
+        <w:t xml:space="preserve">Rules</w:t>
       </w:r>
     </w:p>
     <w:p>
@@ -4827,13 +4781,19 @@
         <w:t xml:space="preserve"> </w:t>
       </w:r>
       <w:r>
-        <w:t xml:space="preserve">Evid.</w:t>
-      </w:r>
-      <w:r>
-        <w:t xml:space="preserve"> </w:t>
-      </w:r>
-      <w:r>
-        <w:t xml:space="preserve">506</w:t>
+        <w:t xml:space="preserve">App.</w:t>
+      </w:r>
+      <w:r>
+        <w:t xml:space="preserve"> </w:t>
+      </w:r>
+      <w:r>
+        <w:t xml:space="preserve">P.</w:t>
+      </w:r>
+      <w:r>
+        <w:t xml:space="preserve"> </w:t>
+      </w:r>
+      <w:r>
+        <w:t xml:space="preserve">30</w:t>
       </w:r>
       <w:r>
         <w:t xml:space="preserve">   </w:t>
@@ -4842,7 +4802,7 @@
         <w:tab/>
       </w:r>
       <w:r>
-        <w:t xml:space="preserve">7, 15</w:t>
+        <w:t xml:space="preserve">21</w:t>
       </w:r>
     </w:p>
     <w:p>
@@ -4873,6 +4833,46 @@
         <w:t xml:space="preserve"> </w:t>
       </w:r>
       <w:r>
+        <w:t xml:space="preserve">506</w:t>
+      </w:r>
+      <w:r>
+        <w:t xml:space="preserve">   </w:t>
+      </w:r>
+      <w:r>
+        <w:tab/>
+      </w:r>
+      <w:r>
+        <w:t xml:space="preserve">4, 12</w:t>
+      </w:r>
+    </w:p>
+    <w:p>
+      <w:pPr>
+        <w:keepLines/>
+        <w:tabs>
+          <w:tab w:val="right" w:leader="dot" w:pos="9360"/>
+        </w:tabs>
+        <w:spacing w:before="196" w:after="0" w:line="322" w:lineRule="exact"/>
+        <w:ind w:left="360" w:right="1120" w:hanging="360"/>
+      </w:pPr>
+      <w:r>
+        <w:t xml:space="preserve">Utah</w:t>
+      </w:r>
+      <w:r>
+        <w:t xml:space="preserve"> </w:t>
+      </w:r>
+      <w:r>
+        <w:t xml:space="preserve">R.</w:t>
+      </w:r>
+      <w:r>
+        <w:t xml:space="preserve"> </w:t>
+      </w:r>
+      <w:r>
+        <w:t xml:space="preserve">Evid.</w:t>
+      </w:r>
+      <w:r>
+        <w:t xml:space="preserve"> </w:t>
+      </w:r>
+      <w:r>
         <w:t xml:space="preserve">510</w:t>
       </w:r>
       <w:r>
@@ -4882,7 +4882,7 @@
         <w:tab/>
       </w:r>
       <w:r>
-        <w:t xml:space="preserve">7</w:t>
+        <w:t xml:space="preserve">4</w:t>
       </w:r>
     </w:p>
     <w:p>
@@ -5621,30 +5621,24 @@
         <w:t xml:space="preserve"> </w:t>
       </w:r>
       <w:r>
-        <w:t xml:space="preserve">2012 UT App 295, ¶¶ 12,20</w:t>
+        <w:t xml:space="preserve">2012 UT App 295, ¶¶ 12,20-⁠21, 288 P.3d 588 (concluding counsel’s failure to address the victim’s allegedly inconsistent statements constituted strategy). Trial counsel has “wide latitude in making tactical decisions” and Utah courts “will not question such decisions unless there is no reasonable basis supporting them.” State v. Crosby,</w:t>
+      </w:r>
+      <w:r>
+        <w:t xml:space="preserve"> </w:t>
+      </w:r>
+      <w:r>
+        <w:t xml:space="preserve">927 P.2d 638, 644 (Utah 1996). And finally, if counsel has made a strategic choice about an issue, that choice is “virtually unchallengeable.” Strickland,</w:t>
+      </w:r>
+      <w:r>
+        <w:t xml:space="preserve"> </w:t>
+      </w:r>
+      <w:r>
+        <w:t xml:space="preserve">466 U.S. at 690</w:t>
       </w:r>
       <w:r>
         <w:noBreakHyphen/>
       </w:r>
       <w:r>
-        <w:t xml:space="preserve">21, 288 P.3d 588 (concluding counsel’s failure to address the victim’s allegedly inconsistent statements constituted strategy). Trial counsel has “wide latitude in making tactical decisions” and Utah courts “will not question such decisions unless there is no reasonable basis supporting them.” State v. Crosby,</w:t>
-      </w:r>
-      <w:r>
-        <w:t xml:space="preserve"> </w:t>
-      </w:r>
-      <w:r>
-        <w:t xml:space="preserve">927 P.2d 638, 644 (Utah 1996). And finally, if counsel has made a strategic choice about an issue, that choice is “virtually unchallengeable.” Strickland,</w:t>
-      </w:r>
-      <w:r>
-        <w:t xml:space="preserve"> </w:t>
-      </w:r>
-      <w:r>
-        <w:t xml:space="preserve">466 U.S. at 690</w:t>
-      </w:r>
-      <w:r>
-        <w:noBreakHyphen/>
-      </w:r>
-      <w:r>
         <w:t xml:space="preserve">91.</w:t>
       </w:r>
     </w:p>
@@ -5723,7 +5717,7 @@
         <w:t xml:space="preserve"> </w:t>
       </w:r>
       <w:r>
-        <w:t xml:space="preserve">requires for several reasons, but foremost among them is that the parties stipulated to, and the court in fact issued, subpoenas for V.M.’s mental health records for in camera review. The trial court reviewed “25 records ranging in size from 1 to more than 250 pages” and found “no information of exculpative. . .value.” (R.303.) Counsel cannot be ineffective in failing to ask the trial court to do so something that the trial court, in fact, did.</w:t>
+        <w:t xml:space="preserve">requires for several reasons, but foremost among them is that the parties stipulated to, and the court in fact issued, subpoenas for V.M.’s mental health records for in camera review. The trial court reviewed “25 records ranging in size from 1 to more than 250 pages” and found “no information of exculpative. . .value.” (R.303.) Counsel cannot be ineffective in failing to ask the trial court to do so something that the trial court, in fact, did.</w:t>
       </w:r>
     </w:p>
     <w:p>
@@ -6171,7 +6165,7 @@
         <w:pStyle w:val="BodyText"/>
       </w:pPr>
       <w:r>
-        <w:t xml:space="preserve">element of any claim or defense. . . Utah R. Evid. 506(d).</w:t>
+        <w:t xml:space="preserve">element of any claim or defense. . . Utah R. Evid. 506(d).</w:t>
       </w:r>
     </w:p>
     <w:p>
@@ -6757,7 +6751,7 @@
         <w:pStyle w:val="BodyText"/>
       </w:pPr>
       <w:r>
-        <w:t xml:space="preserve">Under the third step for rule 506, Defendant must “show to a reasonable certainty that the records sought contain exculpatory evidence.” Worthen, 2009 UT 79, ¶ 15; J.A.L., 2011 UT 27, ¶ 48. The phrase, “reasonable certainty” requires the defendant to show “that the sought-after records actually contain ‘exculpatory evidence. . .which would be favorable to his defense.’” Blake, 2002 UT 113, ¶ 19 (quoting State v. Cardall,</w:t>
+        <w:t xml:space="preserve">Under the third step for rule 506, Defendant must “show to a reasonable certainty that the records sought contain exculpatory evidence.” Worthen, 2009 UT 79, ¶ 15; J.A.L., 2011 UT 27, ¶ 48. The phrase, “reasonable certainty” requires the defendant to show “that the sought-after records actually contain ‘exculpatory evidence. . .which would be favorable to his defense.’” Blake, 2002 UT 113, ¶ 19 (quoting State v. Cardall,</w:t>
       </w:r>
       <w:r>
         <w:t xml:space="preserve"> </w:t>
@@ -7085,25 +7079,157 @@
         <w:pStyle w:val="BodyText"/>
       </w:pPr>
       <w:r>
-        <w:t xml:space="preserve">Next, in Barela, defendant was charged with and convicted of rape after victim reported that defendant had intercourse with her during a massage. 2015 UT 22, ¶¶ 4</w:t>
+        <w:t xml:space="preserve">Next, in Barela, defendant was charged with and convicted of rape after victim reported that defendant had intercourse with her during a massage. 2015 UT 22, ¶¶ 4-⁠10. While victim testified that she was alarmed by the incident, defendant asserted that victim was the instigator. Id. After conviction, defendant raised several issues, including a challenge to jury instructions. The court reversed the conviction due to the flawed instruction, making defendant eligible for a new trial. Id. ¶ 32; Utah R. App. P. 30(b).</w:t>
+      </w:r>
+      <w:r>
+        <w:t xml:space="preserve"> </w:t>
+      </w:r>
+      <w:r>
+        <w:t xml:space="preserve">Although the holding returned the case to a pre-trial posture—where defendant would have the opportunity to make a timely request under rule 14(b) for discovery of privileged records—this court briefly addressed in dictum the defendant’s post-trial request for issuance of a medical records subpoena. 2015 UT 22, ¶¶ 47-⁠50.</w:t>
+      </w:r>
+    </w:p>
+    <w:p>
+      <w:pPr>
+        <w:pStyle w:val="BodyText"/>
+      </w:pPr>
+      <w:r>
+        <w:t xml:space="preserve">The court stated that Utah Rule of Criminal Procedure 14(b) may support a post-trial subpoena request. Id. ¶ 49. The court also cautioned that while a district court “may permit a request later than thirty days before trial,” it is not required to do so and its decision not to allow such discovery will be upheld on appeal. Id. The court reiterated that a defendant must satisfy the stringent test for discovery of privileged information. Id. In addition, “to ensure that no privileged information is released that is unnecessary for discovering exculpatory information, the request must ‘identify the records sought with particularity and be reasonably limited as to subject matter,’” id. (quoting Utah R. Crim. P. 14(b)⁠(2)), something Defendant has wholly failed to do in this case with his broad request for all privileged materials.</w:t>
+      </w:r>
+    </w:p>
+    <w:p>
+      <w:pPr>
+        <w:pStyle w:val="BodyText"/>
+      </w:pPr>
+      <w:r>
+        <w:t xml:space="preserve">Contrary to Defendant’s assertions, Barela does not support a defendant’s absolute right to discover privileged records in post-trial proceedings. It supports the opposite: defendant has no such right and is held to proof of exculpatory evidence before he may be allowed to discover privileged records. Barela does not support Defendant’s requests for issuance of the subpoenas to</w:t>
+      </w:r>
+    </w:p>
+    <w:p>
+      <w:pPr>
+        <w:pStyle w:val="BodyText"/>
+      </w:pPr>
+      <w:r>
+        <w:t xml:space="preserve">(R.3490, 3498.) Moreover, Defendant is incorrect when he asserts</w:t>
+      </w:r>
+    </w:p>
+    <w:p>
+      <w:pPr>
+        <w:pStyle w:val="BodyText"/>
+      </w:pPr>
+      <w:r>
+        <w:t xml:space="preserve">(R.3491.) In this case, defense counsel had several means by which he could address stressors in V.M.’s life. As Defendant points out, jurors learned that</w:t>
+      </w:r>
+    </w:p>
+    <w:p>
+      <w:pPr>
+        <w:pStyle w:val="BodyText"/>
+      </w:pPr>
+      <w:r>
+        <w:t xml:space="preserve">(R.3491</w:t>
       </w:r>
       <w:r>
         <w:noBreakHyphen/>
       </w:r>
       <w:r>
-        <w:t xml:space="preserve">10. While victim testified that she was alarmed by the incident, defendant asserted that victim was the instigator. Id. After conviction, defendant raised several issues, including a challenge to jury instructions. The court reversed the conviction due to the flawed instruction, making defendant eligible for a new trial. Id. ¶ 32; Utah R. App. P. 30(b).</w:t>
-      </w:r>
-      <w:r>
-        <w:t xml:space="preserve"> </w:t>
-      </w:r>
-      <w:r>
-        <w:t xml:space="preserve">Although the holding returned the case to a pre-trial posture—where defendant would have the opportunity to make a timely request under rule 14(b) for discovery of privileged records—this court briefly addressed in dictum the defendant’s post-trial request for issuance of a medical records subpoena. 2015 UT 22, ¶¶ 47</w:t>
+        <w:t xml:space="preserve">92; see also R.3485</w:t>
+      </w:r>
+    </w:p>
+    <w:p>
+      <w:pPr>
+        <w:pStyle w:val="BodyText"/>
+      </w:pPr>
+      <w:r>
+        <w:t xml:space="preserve">.) That information allowed the defense to present information without delving into V.M.’s privileged records.</w:t>
+      </w:r>
+    </w:p>
+    <w:p>
+      <w:pPr>
+        <w:pStyle w:val="BodyText"/>
+      </w:pPr>
+      <w:r>
+        <w:t xml:space="preserve">Where Defendant believes that V.M.’s mental health records contain information about those stressors, his argument does not support grounds for issuance of subpoenas because any such information would have been cumulative and unnecessary. See King, 2012 UT App 203, ¶ 24 (counsel’s failure to retain mental health expert and to obtain mental health records was not ineffective where information would have been primarily cumulative of other impeachment evidence presented at trial). Because Defendant has not demonstrated here that privileged records actually contain exculpatory evidence favorable to his case, Barela, 2015 UT 22, ¶ 49, and because the information likely would be cumulative of information presented to the jury, Defendant’s arguments fail. 4. Victims Possess an Independent Constitutional and Statutory</w:t>
+      </w:r>
+    </w:p>
+    <w:p>
+      <w:pPr>
+        <w:pStyle w:val="BodyText"/>
+      </w:pPr>
+      <w:r>
+        <w:t xml:space="preserve">Protections Against Compelled Disclosure of Confidential Counseling</w:t>
+      </w:r>
+    </w:p>
+    <w:p>
+      <w:pPr>
+        <w:pStyle w:val="BodyText"/>
+      </w:pPr>
+      <w:r>
+        <w:t xml:space="preserve">Information</w:t>
+      </w:r>
+    </w:p>
+    <w:p>
+      <w:pPr>
+        <w:pStyle w:val="BodyText"/>
+      </w:pPr>
+      <w:r>
+        <w:t xml:space="preserve">In addition to the therapist-patient privilege protected by Rule 506, when the patient is a crime victim, Utah’s Victims’ Rights Amendment and the Rights of Crime Victims Act affords her greater protections. This is even truer when the victim was a child or a victim of sexual assault. See, e.g., Utah Code § 77-⁠37-⁠1(2)</w:t>
+      </w:r>
+      <w:r>
+        <w:t xml:space="preserve"> </w:t>
+      </w:r>
+      <w:r>
+        <w:t xml:space="preserve">(“The Legislature finds it necessary to provide child victims and child witnesses with additional consideration and different treatment than that usually afforded adults.”); Blake, 2002 UT 113, ¶ 15 (“Utah has enacted both statutes and rules of evidence designed specifically to protect the victims of sexual assault.”).</w:t>
+      </w:r>
+    </w:p>
+    <w:p>
+      <w:pPr>
+        <w:pStyle w:val="BodyText"/>
+      </w:pPr>
+      <w:r>
+        <w:t xml:space="preserve">V.M. has strong legal interests in the non-disclosure of her confidential mental health records. Further disclosure of any kind, even for in camera review, undermines her right to privacy, “[t]o be treated with fairness, respect, and dignity,” Utah Const. art. I, § 28(1)⁠(a),</w:t>
+      </w:r>
+      <w:r>
+        <w:t xml:space="preserve"> </w:t>
+      </w:r>
+      <w:r>
+        <w:t xml:space="preserve">and her right to be treated with “additional consideration” because of her age at the time of the sexual abuse she endured. Utah Code Ann. § 77-⁠37-⁠1(2).</w:t>
+      </w:r>
+    </w:p>
+    <w:p>
+      <w:pPr>
+        <w:pStyle w:val="BodyText"/>
+      </w:pPr>
+      <w:r>
+        <w:t xml:space="preserve">Crime victims have a privacy interest in the non-disclosure of their medical records. See, e.g., Whalen v. Roe,</w:t>
+      </w:r>
+      <w:r>
+        <w:t xml:space="preserve"> </w:t>
+      </w:r>
+      <w:r>
+        <w:t xml:space="preserve">429 U.S. 589, 599</w:t>
       </w:r>
       <w:r>
         <w:noBreakHyphen/>
       </w:r>
       <w:r>
-        <w:t xml:space="preserve">50.</w:t>
+        <w:t xml:space="preserve">600 (1977); State v. Gonzales,</w:t>
+      </w:r>
+      <w:r>
+        <w:t xml:space="preserve"> </w:t>
+      </w:r>
+      <w:r>
+        <w:t xml:space="preserve">2005 UT 72, ¶ 41, 125 P.3d 878; State v. Cramer,</w:t>
+      </w:r>
+      <w:r>
+        <w:t xml:space="preserve"> </w:t>
+      </w:r>
+      <w:r>
+        <w:t xml:space="preserve">2002 UT 9, ¶ 22, 44 P.3d 690. Maintaining confidentiality of mental health and counseling records is necessary to ensure victim treatment and recovery. Jaffe v. Redmond,</w:t>
+      </w:r>
+      <w:r>
+        <w:t xml:space="preserve"> </w:t>
+      </w:r>
+      <w:r>
+        <w:t xml:space="preserve">518 U.S. 1, 10 (1996). In the context of sexual abuse, it is essential to protect the privacy interests of the victim because disclosure often causes retraumatization or revictimization. See, e.g., Wengreen, 2007 UT App 264, ¶ 18.</w:t>
       </w:r>
     </w:p>
     <w:p>
@@ -7111,211 +7237,19 @@
         <w:pStyle w:val="BodyText"/>
       </w:pPr>
       <w:r>
-        <w:t xml:space="preserve">The court stated that Utah Rule of Criminal Procedure 14(b) may support a post-trial subpoena request. Id. ¶ 49. The court also cautioned that while a district court “may permit a request later than thirty days before trial,” it is not required to do so and its decision not to allow such discovery will be upheld on appeal. Id. The court reiterated that a defendant must satisfy the stringent test for discovery of privileged information. Id. In addition, “to ensure that no privileged information is released that is unnecessary for discovering exculpatory information, the request must ‘identify the records sought with particularity and be reasonably limited as to subject matter,’” id. (quoting Utah R. Crim. P. 14(b)⁠(2)), something Defendant has wholly failed to do in this case with his broad request for all privileged materials.</w:t>
-      </w:r>
-    </w:p>
-    <w:p>
-      <w:pPr>
-        <w:pStyle w:val="BodyText"/>
-      </w:pPr>
-      <w:r>
-        <w:t xml:space="preserve">Contrary to Defendant’s assertions, Barela does not support a defendant’s absolute right to discover privileged records in post-trial proceedings. It supports the opposite: defendant has no such right and is held to proof of exculpatory evidence before he may be allowed to discover privileged records. Barela does not support Defendant’s requests for issuance of the subpoenas to</w:t>
-      </w:r>
-    </w:p>
-    <w:p>
-      <w:pPr>
-        <w:pStyle w:val="BodyText"/>
-      </w:pPr>
-      <w:r>
-        <w:t xml:space="preserve">(R.3490, 3498.) Moreover, Defendant is incorrect when he asserts</w:t>
-      </w:r>
-    </w:p>
-    <w:p>
-      <w:pPr>
-        <w:pStyle w:val="BodyText"/>
-      </w:pPr>
-      <w:r>
-        <w:t xml:space="preserve">(R.3491.) In this case, defense counsel had several means by which he could address stressors in V.M.’s life. As Defendant points out, jurors learned that</w:t>
-      </w:r>
-    </w:p>
-    <w:p>
-      <w:pPr>
-        <w:pStyle w:val="BodyText"/>
-      </w:pPr>
-      <w:r>
-        <w:t xml:space="preserve">(R.3491</w:t>
-      </w:r>
-      <w:r>
-        <w:noBreakHyphen/>
-      </w:r>
-      <w:r>
-        <w:t xml:space="preserve">92; see also R.3485</w:t>
-      </w:r>
-    </w:p>
-    <w:p>
-      <w:pPr>
-        <w:pStyle w:val="BodyText"/>
-      </w:pPr>
-      <w:r>
-        <w:t xml:space="preserve">.) That information allowed the defense to present information without delving into V.M.’s privileged records.</w:t>
-      </w:r>
-    </w:p>
-    <w:p>
-      <w:pPr>
-        <w:pStyle w:val="BodyText"/>
-      </w:pPr>
-      <w:r>
-        <w:t xml:space="preserve">Where Defendant believes that V.M.’s mental health records contain information about those stressors, his argument does not support grounds for issuance of subpoenas because any such information would have been cumulative and unnecessary. See King, 2012 UT App 203, ¶ 24 (counsel’s failure to retain mental health expert and to obtain mental health records was not ineffective where information would have been primarily cumulative of other impeachment evidence presented at trial). Because Defendant has not demonstrated here that privileged records actually contain exculpatory evidence favorable to his case, Barela, 2015 UT 22, ¶ 49, and because the information likely would be cumulative of information presented to the jury, Defendant’s arguments fail. 4. Victims Possess an Independent Constitutional and Statutory</w:t>
-      </w:r>
-    </w:p>
-    <w:p>
-      <w:pPr>
-        <w:pStyle w:val="BodyText"/>
-      </w:pPr>
-      <w:r>
-        <w:t xml:space="preserve">Protections Against Compelled Disclosure of Confidential Counseling</w:t>
-      </w:r>
-    </w:p>
-    <w:p>
-      <w:pPr>
-        <w:pStyle w:val="BodyText"/>
-      </w:pPr>
-      <w:r>
-        <w:t xml:space="preserve">Information</w:t>
-      </w:r>
-    </w:p>
-    <w:p>
-      <w:pPr>
-        <w:pStyle w:val="BodyText"/>
-      </w:pPr>
-      <w:r>
-        <w:t xml:space="preserve">In addition to the therapist-patient privilege protected by Rule 506, when the patient is a crime victim, Utah’s Victims’ Rights Amendment and the Rights of Crime Victims Act affords her greater protections. This is even truer when the victim was a child or a victim of sexual assault. See, e.g., Utah Code § 77</w:t>
-      </w:r>
-      <w:r>
-        <w:noBreakHyphen/>
-      </w:r>
-      <w:r>
-        <w:t xml:space="preserve">37</w:t>
-      </w:r>
-      <w:r>
-        <w:noBreakHyphen/>
-      </w:r>
-      <w:r>
-        <w:t xml:space="preserve">1(2)</w:t>
-      </w:r>
-      <w:r>
-        <w:t xml:space="preserve"> </w:t>
-      </w:r>
-      <w:r>
-        <w:t xml:space="preserve">(“The Legislature finds it necessary to provide child victims and child witnesses with additional consideration and different treatment than that usually afforded adults.”); Blake, 2002 UT 113, ¶ 15 (“Utah has enacted both statutes and rules of evidence designed specifically to protect the victims of sexual assault.”).</w:t>
-      </w:r>
-    </w:p>
-    <w:p>
-      <w:pPr>
-        <w:pStyle w:val="BodyText"/>
-      </w:pPr>
-      <w:r>
-        <w:t xml:space="preserve">V.M. has strong legal interests in the non-disclosure of her confidential mental health records. Further disclosure of any kind, even for in camera review, undermines her right to privacy, “[t]o be treated with fairness, respect, and dignity,” Utah Const. art. I, § 28(1)⁠(a),</w:t>
-      </w:r>
-      <w:r>
-        <w:t xml:space="preserve"> </w:t>
-      </w:r>
-      <w:r>
-        <w:t xml:space="preserve">and her right to be treated with “additional consideration” because of her age at the time of the sexual abuse she endured. Utah Code Ann. § 77</w:t>
-      </w:r>
-      <w:r>
-        <w:noBreakHyphen/>
-      </w:r>
-      <w:r>
-        <w:t xml:space="preserve">37</w:t>
-      </w:r>
-      <w:r>
-        <w:noBreakHyphen/>
-      </w:r>
-      <w:r>
-        <w:t xml:space="preserve">1(2).</w:t>
-      </w:r>
-    </w:p>
-    <w:p>
-      <w:pPr>
-        <w:pStyle w:val="BodyText"/>
-      </w:pPr>
-      <w:r>
-        <w:t xml:space="preserve">Crime victims have a privacy interest in the non-disclosure of their medical records. See, e.g., Whalen v. Roe,</w:t>
-      </w:r>
-      <w:r>
-        <w:t xml:space="preserve"> </w:t>
-      </w:r>
-      <w:r>
-        <w:t xml:space="preserve">429 U.S. 589, 599</w:t>
-      </w:r>
-      <w:r>
-        <w:noBreakHyphen/>
-      </w:r>
-      <w:r>
-        <w:t xml:space="preserve">600 (1977); State v. Gonzales,</w:t>
-      </w:r>
-      <w:r>
-        <w:t xml:space="preserve"> </w:t>
-      </w:r>
-      <w:r>
-        <w:t xml:space="preserve">2005 UT 72, ¶ 41, 125 P.3d 878; State v. Cramer,</w:t>
-      </w:r>
-      <w:r>
-        <w:t xml:space="preserve"> </w:t>
-      </w:r>
-      <w:r>
-        <w:t xml:space="preserve">2002 UT 9, ¶ 22, 44 P.3d 690. Maintaining confidentiality of mental health and counseling records is necessary to ensure victim treatment and recovery. Jaffe v. Redmond,</w:t>
-      </w:r>
-      <w:r>
-        <w:t xml:space="preserve"> </w:t>
-      </w:r>
-      <w:r>
-        <w:t xml:space="preserve">518 U.S. 1, 10 (1996). In the context of sexual abuse, it is essential to protect the privacy interests of the victim because disclosure often causes retraumatization or revictimization. See, e.g., Wengreen, 2007 UT App 264, ¶ 18.</w:t>
-      </w:r>
-    </w:p>
-    <w:p>
-      <w:pPr>
-        <w:pStyle w:val="BodyText"/>
-      </w:pPr>
-      <w:r>
         <w:t xml:space="preserve">In addition to the privacy interest at stake, V.M. has a right to be treated with “fairness, respect, and dignity, and to be free from harassment and abuse throughout the criminal justice process.” Utah Const. art. I, § 28(1)⁠(a);</w:t>
       </w:r>
       <w:r>
         <w:t xml:space="preserve"> </w:t>
       </w:r>
       <w:r>
-        <w:t xml:space="preserve">see also Utah Code § 77</w:t>
-      </w:r>
-      <w:r>
-        <w:noBreakHyphen/>
-      </w:r>
-      <w:r>
-        <w:t xml:space="preserve">37</w:t>
-      </w:r>
-      <w:r>
-        <w:noBreakHyphen/>
-      </w:r>
-      <w:r>
-        <w:t xml:space="preserve">1(1).</w:t>
-      </w:r>
-      <w:r>
-        <w:t xml:space="preserve"> </w:t>
-      </w:r>
-      <w:r>
-        <w:t xml:space="preserve">Courts have a further duty to ensure that child victims’ “participation in the criminal justice process be conducted in the most effective and least traumatic, intrusive, or intimidating manner.” Utah Code § 77</w:t>
-      </w:r>
-      <w:r>
-        <w:noBreakHyphen/>
-      </w:r>
-      <w:r>
-        <w:t xml:space="preserve">37</w:t>
-      </w:r>
-      <w:r>
-        <w:noBreakHyphen/>
-      </w:r>
-      <w:r>
-        <w:t xml:space="preserve">1(2);</w:t>
+        <w:t xml:space="preserve">see also Utah Code § 77-⁠37-⁠1(1).</w:t>
+      </w:r>
+      <w:r>
+        <w:t xml:space="preserve"> </w:t>
+      </w:r>
+      <w:r>
+        <w:t xml:space="preserve">Courts have a further duty to ensure that child victims’ “participation in the criminal justice process be conducted in the most effective and least traumatic, intrusive, or intimidating manner.” Utah Code § 77-⁠37-⁠1(2);</w:t>
       </w:r>
       <w:r>
         <w:t xml:space="preserve"> </w:t>
@@ -7327,37 +7261,13 @@
         <w:t xml:space="preserve"> </w:t>
       </w:r>
       <w:r>
-        <w:t xml:space="preserve">2006 UT 13, ¶ 13, 131 P.3d 239 (“It is the policy of this state that child victims and child witnesses are to be afforded extra consideration in our criminal trial process.”). As noted above, disclosure of private counseling records often hinders recovery and leads to revictimization, thereby potentially violating V.M.’s right to be free from further abuse and the least traumatic criminal process. Utah Code §§ 77</w:t>
-      </w:r>
-      <w:r>
-        <w:noBreakHyphen/>
-      </w:r>
-      <w:r>
-        <w:t xml:space="preserve">37</w:t>
-      </w:r>
-      <w:r>
-        <w:noBreakHyphen/>
-      </w:r>
-      <w:r>
-        <w:t xml:space="preserve">4(1);</w:t>
-      </w:r>
-      <w:r>
-        <w:t xml:space="preserve"> </w:t>
-      </w:r>
-      <w:r>
-        <w:t xml:space="preserve">§ 77</w:t>
-      </w:r>
-      <w:r>
-        <w:noBreakHyphen/>
-      </w:r>
-      <w:r>
-        <w:t xml:space="preserve">39</w:t>
-      </w:r>
-      <w:r>
-        <w:noBreakHyphen/>
-      </w:r>
-      <w:r>
-        <w:t xml:space="preserve">2(1).</w:t>
+        <w:t xml:space="preserve">2006 UT 13, ¶ 13, 131 P.3d 239 (“It is the policy of this state that child victims and child witnesses are to be afforded extra consideration in our criminal trial process.”). As noted above, disclosure of private counseling records often hinders recovery and leads to revictimization, thereby potentially violating V.M.’s right to be free from further abuse and the least traumatic criminal process. Utah Code §§ 77-⁠37-⁠4(1);</w:t>
+      </w:r>
+      <w:r>
+        <w:t xml:space="preserve"> </w:t>
+      </w:r>
+      <w:r>
+        <w:t xml:space="preserve">§ 77-⁠39-⁠2(1).</w:t>
       </w:r>
       <w:r>
         <w:t xml:space="preserve"> </w:t>
@@ -9889,6 +9799,33 @@
       <w:ind w:left="2160" w:hanging="720"/>
     </w:pPr>
   </w:style>
+  <w:style w:type="paragraph" w:customStyle="1" w:styleId="XdQuoteList1">
+    <w:name w:val="Xd Quote List 1"/>
+    <w:basedOn w:val="Normal"/>
+    <w:qFormat/>
+    <w:pPr>
+      <w:spacing w:before="0" w:after="0" w:line="322" w:lineRule="exact"/>
+      <w:ind w:left="1440" w:right="720" w:hanging="720"/>
+    </w:pPr>
+  </w:style>
+  <w:style w:type="paragraph" w:customStyle="1" w:styleId="XdQuoteList2">
+    <w:name w:val="Xd Quote List 2"/>
+    <w:basedOn w:val="Normal"/>
+    <w:qFormat/>
+    <w:pPr>
+      <w:spacing w:before="0" w:after="0" w:line="322" w:lineRule="exact"/>
+      <w:ind w:left="2160" w:right="720" w:hanging="720"/>
+    </w:pPr>
+  </w:style>
+  <w:style w:type="paragraph" w:customStyle="1" w:styleId="XdQuoteList3">
+    <w:name w:val="Xd Quote List 3"/>
+    <w:basedOn w:val="Normal"/>
+    <w:qFormat/>
+    <w:pPr>
+      <w:spacing w:before="0" w:after="0" w:line="322" w:lineRule="exact"/>
+      <w:ind w:left="2880" w:right="720" w:hanging="720"/>
+    </w:pPr>
+  </w:style>
   <w:style w:type="paragraph" w:customStyle="1" w:styleId="XdList1">
     <w:name w:val="XdList1"/>
     <w:basedOn w:val="BodyText"/>

</xml_diff>